<commit_message>
Parcours commercial : e-mails réécrits, ton personnel et peu commercial
Co-Authored-By: Claude Opus 5.5 <noreply@anthropic.com>
Claude-Session: https://claude.ai/code/session_011Pkw66dvWaWL3FuR6H1cyg
</commit_message>
<xml_diff>
--- a/prospection/parcours-commercial-atelier-truelle.docx
+++ b/prospection/parcours-commercial-atelier-truelle.docx
@@ -2163,6 +2163,25 @@
     </w:p>
     <w:p>
       <w:pPr>
+        <w:pStyle w:val="ListParagraph"/>
+        <w:numPr>
+          <w:ilvl w:val="0"/>
+          <w:numId w:val="2"/>
+        </w:numPr>
+        <w:spacing w:after="60" w:line="290"/>
+      </w:pPr>
+      <w:r>
+        <w:rPr>
+          <w:rFonts w:ascii="Calibri" w:cs="Calibri" w:eastAsia="Calibri" w:hAnsi="Calibri"/>
+          <w:color w:val="14191C"/>
+          <w:sz w:val="22"/>
+          <w:szCs w:val="22"/>
+        </w:rPr>
+        <w:t xml:space="preserve">Les e-mails partent en texte simple, sans mise en forme ni logo : comme un message écrit à la main, ils passent mieux les filtres et se lisent comme un vrai message.</w:t>
+      </w:r>
+    </w:p>
+    <w:p>
+      <w:pPr>
         <w:pStyle w:val="Heading1"/>
         <w:pageBreakBefore/>
         <w:spacing w:after="200"/>
@@ -2190,7 +2209,7 @@
           <w:sz w:val="22"/>
           <w:szCs w:val="22"/>
         </w:rPr>
-        <w:t xml:space="preserve">Les textes entre crochets sont remplis automatiquement pour chaque prospect. Le ton : simple, direct, vouvoiement, aucune promesse chiffrée qu'on ne peut pas tenir.</w:t>
+        <w:t xml:space="preserve">Les textes entre crochets sont remplis pour chaque prospect, à la main ou presque : chaque premier e-mail parle de son entreprise, pas d'une entreprise en général. Le ton : celui d'un artisan qui écrit à un autre artisan. Court, simple, vouvoiement, pas de formule de commercial, pas de promesse.</w:t>
       </w:r>
     </w:p>
     <w:p>
@@ -2281,7 +2300,7 @@
                 <w:sz w:val="21"/>
                 <w:szCs w:val="21"/>
               </w:rPr>
-              <w:t xml:space="preserve">[Entreprise] : votre site, refait avant de vous en parler</w:t>
+              <w:t xml:space="preserve">Votre site</w:t>
             </w:r>
           </w:p>
           <w:p>
@@ -2295,7 +2314,7 @@
                 <w:sz w:val="21"/>
                 <w:szCs w:val="21"/>
               </w:rPr>
-              <w:t xml:space="preserve">Bonjour [Monsieur / Madame Nom],</w:t>
+              <w:t xml:space="preserve">Bonjour Monsieur [Nom],</w:t>
             </w:r>
           </w:p>
           <w:p>
@@ -2309,7 +2328,7 @@
                 <w:sz w:val="21"/>
                 <w:szCs w:val="21"/>
               </w:rPr>
-              <w:t xml:space="preserve">Je m'appelle [Prénom], de l'Atelier Truelle : nous faisons les sites internet des entreprises du bâtiment en Île-de-France.</w:t>
+              <w:t xml:space="preserve">Je regardais les sites des entreprises de [plomberie] du [16e] et je suis passé sur le vôtre. [Constat simple, en une phrase : il commence à dater, et sur téléphone il est difficile à lire.] C'est dommage pour une maison comme la vôtre.</w:t>
             </w:r>
           </w:p>
           <w:p>
@@ -2323,27 +2342,8 @@
                 <w:sz w:val="21"/>
                 <w:szCs w:val="21"/>
               </w:rPr>
-              <w:t xml:space="preserve">[Entreprise] est installée [adresse / depuis année], et votre travail mérite mieux que votre site actuel : [constat précis, par exemple : il n'est pas sécurisé (http) et difficile à lire sur téléphone, alors que la majorité de vos clients vous cherchent depuis leur mobile].</w:t>
-            </w:r>
-          </w:p>
-          <w:p>
-            <w:pPr>
-              <w:spacing w:after="90" w:line="280"/>
-            </w:pPr>
-            <w:r>
-              <w:rPr>
-                <w:rFonts w:ascii="Calibri" w:cs="Calibri" w:eastAsia="Calibri" w:hAnsi="Calibri"/>
-                <w:color w:val="14191C"/>
-                <w:sz w:val="21"/>
-                <w:szCs w:val="21"/>
-              </w:rPr>
-              <w:t xml:space="preserve">Plutôt que de vous l'expliquer, je l'ai refait. Avec votre logo, vos textes et vos photos :</w:t>
-            </w:r>
-          </w:p>
-          <w:p>
-            <w:pPr>
-              <w:spacing w:after="90" w:line="280"/>
-            </w:pPr>
+              <w:t xml:space="preserve">Je fais des sites pour les artisans, alors je me suis permis de refaire le vôtre, avec vos textes et vos photos. Vous pouvez le voir ici : </w:t>
+            </w:r>
             <w:r>
               <w:rPr>
                 <w:rFonts w:ascii="Calibri" w:cs="Calibri" w:eastAsia="Calibri" w:hAnsi="Calibri"/>
@@ -2353,7 +2353,7 @@
                 <w:sz w:val="21"/>
                 <w:szCs w:val="21"/>
               </w:rPr>
-              <w:t xml:space="preserve">[lien de la maquette]</w:t>
+              <w:t xml:space="preserve">[lien]</w:t>
             </w:r>
           </w:p>
           <w:p>
@@ -2367,7 +2367,7 @@
                 <w:sz w:val="21"/>
                 <w:szCs w:val="21"/>
               </w:rPr>
-              <w:t xml:space="preserve">Elle est privée, gratuite et sans engagement. Si quelque chose ne vous plaît pas, nous la modifions selon vos goûts, sans rien payer, jusqu'à ce que vous soyez d'accord. Le devis ne vient qu'après.</w:t>
+              <w:t xml:space="preserve">Ça ne vous engage à rien. Si ça vous plaît, on en parle, et on peut le modifier comme vous voulez. Sinon, pas de souci, je le supprime.</w:t>
             </w:r>
           </w:p>
           <w:p>
@@ -2381,7 +2381,7 @@
                 <w:sz w:val="21"/>
                 <w:szCs w:val="21"/>
               </w:rPr>
-              <w:t xml:space="preserve">Je vous appelle dans quelques jours pour avoir votre avis.</w:t>
+              <w:t xml:space="preserve">Je me permettrai de vous appeler la semaine prochaine pour avoir votre avis.</w:t>
             </w:r>
           </w:p>
           <w:p>
@@ -2395,7 +2395,7 @@
                 <w:sz w:val="21"/>
                 <w:szCs w:val="21"/>
               </w:rPr>
-              <w:t xml:space="preserve">Bien cordialement,</w:t>
+              <w:t xml:space="preserve">Firas</w:t>
             </w:r>
           </w:p>
           <w:p>
@@ -2409,7 +2409,7 @@
                 <w:sz w:val="21"/>
                 <w:szCs w:val="21"/>
               </w:rPr>
-              <w:t xml:space="preserve">Prénom Nom, Atelier Truelle</w:t>
+              <w:t xml:space="preserve">Atelier Truelle · 06 00 00 00 00</w:t>
             </w:r>
           </w:p>
           <w:p>
@@ -2423,35 +2423,7 @@
                 <w:sz w:val="21"/>
                 <w:szCs w:val="21"/>
               </w:rPr>
-              <w:t xml:space="preserve">Sites internet pour les entreprises du bâtiment, Île-de-France</w:t>
-            </w:r>
-          </w:p>
-          <w:p>
-            <w:pPr>
-              <w:spacing w:after="90" w:line="280"/>
-            </w:pPr>
-            <w:r>
-              <w:rPr>
-                <w:rFonts w:ascii="Calibri" w:cs="Calibri" w:eastAsia="Calibri" w:hAnsi="Calibri"/>
-                <w:color w:val="14191C"/>
-                <w:sz w:val="21"/>
-                <w:szCs w:val="21"/>
-              </w:rPr>
-              <w:t xml:space="preserve">06 00 00 00 00 · contact@ateliertruelle.fr · ateliertruelle.fr</w:t>
-            </w:r>
-          </w:p>
-          <w:p>
-            <w:pPr>
-              <w:spacing w:after="90" w:line="280"/>
-            </w:pPr>
-            <w:r>
-              <w:rPr>
-                <w:rFonts w:ascii="Calibri" w:cs="Calibri" w:eastAsia="Calibri" w:hAnsi="Calibri"/>
-                <w:color w:val="14191C"/>
-                <w:sz w:val="21"/>
-                <w:szCs w:val="21"/>
-              </w:rPr>
-              <w:t xml:space="preserve">Vous ne souhaitez plus recevoir de message de notre part ? Répondez « stop » : nous ne vous écrirons plus.</w:t>
+              <w:t xml:space="preserve">PS : si vous préférez que je ne vous écrive plus, dites-le moi simplement.</w:t>
             </w:r>
           </w:p>
         </w:tc>
@@ -2550,7 +2522,7 @@
                 <w:sz w:val="21"/>
                 <w:szCs w:val="21"/>
               </w:rPr>
-              <w:t xml:space="preserve">Re : [Entreprise] : votre site, refait avant de vous en parler</w:t>
+              <w:t xml:space="preserve">Re : Votre site</w:t>
             </w:r>
           </w:p>
           <w:p>
@@ -2564,7 +2536,7 @@
                 <w:sz w:val="21"/>
                 <w:szCs w:val="21"/>
               </w:rPr>
-              <w:t xml:space="preserve">Bonjour [Monsieur / Madame Nom],</w:t>
+              <w:t xml:space="preserve">Bonjour Monsieur [Nom],</w:t>
             </w:r>
           </w:p>
           <w:p>
@@ -2578,7 +2550,7 @@
                 <w:sz w:val="21"/>
                 <w:szCs w:val="21"/>
               </w:rPr>
-              <w:t xml:space="preserve">Je me permets un seul rappel : la maquette de votre site est toujours en ligne, ici : </w:t>
+              <w:t xml:space="preserve">Je reviens vers vous pour la maquette de votre site : </w:t>
             </w:r>
             <w:r>
               <w:rPr>
@@ -2591,15 +2563,6 @@
               </w:rPr>
               <w:t xml:space="preserve">[lien]</w:t>
             </w:r>
-            <w:r>
-              <w:rPr>
-                <w:rFonts w:ascii="Calibri" w:cs="Calibri" w:eastAsia="Calibri" w:hAnsi="Calibri"/>
-                <w:color w:val="14191C"/>
-                <w:sz w:val="21"/>
-                <w:szCs w:val="21"/>
-              </w:rPr>
-              <w:t xml:space="preserve">.</w:t>
-            </w:r>
           </w:p>
           <w:p>
             <w:pPr>
@@ -2612,7 +2575,7 @@
                 <w:sz w:val="21"/>
                 <w:szCs w:val="21"/>
               </w:rPr>
-              <w:t xml:space="preserve">Elle se regarde en deux minutes sur un téléphone. Si le sujet ne vous intéresse pas, un simple « non merci » suffit : je n'insisterai pas.</w:t>
+              <w:t xml:space="preserve">Vous avez pu y jeter un œil ?</w:t>
             </w:r>
           </w:p>
           <w:p>
@@ -2626,7 +2589,7 @@
                 <w:sz w:val="21"/>
                 <w:szCs w:val="21"/>
               </w:rPr>
-              <w:t xml:space="preserve">Bien cordialement,</w:t>
+              <w:t xml:space="preserve">Firas</w:t>
             </w:r>
           </w:p>
           <w:p>
@@ -2640,49 +2603,7 @@
                 <w:sz w:val="21"/>
                 <w:szCs w:val="21"/>
               </w:rPr>
-              <w:t xml:space="preserve">Prénom Nom, Atelier Truelle</w:t>
-            </w:r>
-          </w:p>
-          <w:p>
-            <w:pPr>
-              <w:spacing w:after="90" w:line="280"/>
-            </w:pPr>
-            <w:r>
-              <w:rPr>
-                <w:rFonts w:ascii="Calibri" w:cs="Calibri" w:eastAsia="Calibri" w:hAnsi="Calibri"/>
-                <w:color w:val="14191C"/>
-                <w:sz w:val="21"/>
-                <w:szCs w:val="21"/>
-              </w:rPr>
-              <w:t xml:space="preserve">Sites internet pour les entreprises du bâtiment, Île-de-France</w:t>
-            </w:r>
-          </w:p>
-          <w:p>
-            <w:pPr>
-              <w:spacing w:after="90" w:line="280"/>
-            </w:pPr>
-            <w:r>
-              <w:rPr>
-                <w:rFonts w:ascii="Calibri" w:cs="Calibri" w:eastAsia="Calibri" w:hAnsi="Calibri"/>
-                <w:color w:val="14191C"/>
-                <w:sz w:val="21"/>
-                <w:szCs w:val="21"/>
-              </w:rPr>
-              <w:t xml:space="preserve">06 00 00 00 00 · contact@ateliertruelle.fr · ateliertruelle.fr</w:t>
-            </w:r>
-          </w:p>
-          <w:p>
-            <w:pPr>
-              <w:spacing w:after="90" w:line="280"/>
-            </w:pPr>
-            <w:r>
-              <w:rPr>
-                <w:rFonts w:ascii="Calibri" w:cs="Calibri" w:eastAsia="Calibri" w:hAnsi="Calibri"/>
-                <w:color w:val="14191C"/>
-                <w:sz w:val="21"/>
-                <w:szCs w:val="21"/>
-              </w:rPr>
-              <w:t xml:space="preserve">Vous ne souhaitez plus recevoir de message de notre part ? Répondez « stop » : nous ne vous écrirons plus.</w:t>
+              <w:t xml:space="preserve">Atelier Truelle · 06 00 00 00 00</w:t>
             </w:r>
           </w:p>
         </w:tc>
@@ -2781,7 +2702,7 @@
                 <w:sz w:val="21"/>
                 <w:szCs w:val="21"/>
               </w:rPr>
-              <w:t xml:space="preserve">Je ne vous dérange plus</w:t>
+              <w:t xml:space="preserve">Re : Votre site</w:t>
             </w:r>
           </w:p>
           <w:p>
@@ -2795,7 +2716,7 @@
                 <w:sz w:val="21"/>
                 <w:szCs w:val="21"/>
               </w:rPr>
-              <w:t xml:space="preserve">Bonjour [Monsieur / Madame Nom],</w:t>
+              <w:t xml:space="preserve">Bonjour Monsieur [Nom],</w:t>
             </w:r>
           </w:p>
           <w:p>
@@ -2809,7 +2730,7 @@
                 <w:sz w:val="21"/>
                 <w:szCs w:val="21"/>
               </w:rPr>
-              <w:t xml:space="preserve">Je n'ai pas eu de retour, je comprends : vous avez des chantiers à faire tourner. C'est mon dernier message.</w:t>
+              <w:t xml:space="preserve">Je ne vais pas vous embêter plus longtemps, vous avez sûrement d'autres priorités.</w:t>
             </w:r>
           </w:p>
           <w:p>
@@ -2823,7 +2744,7 @@
                 <w:sz w:val="21"/>
                 <w:szCs w:val="21"/>
               </w:rPr>
-              <w:t xml:space="preserve">La maquette reste accessible encore quinze jours : </w:t>
+              <w:t xml:space="preserve">Je laisse la maquette en ligne encore quinze jours si vous voulez la regarder à tête reposée : </w:t>
             </w:r>
             <w:r>
               <w:rPr>
@@ -2836,15 +2757,6 @@
               </w:rPr>
               <w:t xml:space="preserve">[lien]</w:t>
             </w:r>
-            <w:r>
-              <w:rPr>
-                <w:rFonts w:ascii="Calibri" w:cs="Calibri" w:eastAsia="Calibri" w:hAnsi="Calibri"/>
-                <w:color w:val="14191C"/>
-                <w:sz w:val="21"/>
-                <w:szCs w:val="21"/>
-              </w:rPr>
-              <w:t xml:space="preserve">. Ensuite, je la supprime.</w:t>
-            </w:r>
           </w:p>
           <w:p>
             <w:pPr>
@@ -2857,7 +2769,7 @@
                 <w:sz w:val="21"/>
                 <w:szCs w:val="21"/>
               </w:rPr>
-              <w:t xml:space="preserve">Si un jour vous voulez en parler, il suffit de répondre à cet e-mail.</w:t>
+              <w:t xml:space="preserve">Bonne continuation,</w:t>
             </w:r>
           </w:p>
           <w:p>
@@ -2871,7 +2783,7 @@
                 <w:sz w:val="21"/>
                 <w:szCs w:val="21"/>
               </w:rPr>
-              <w:t xml:space="preserve">Bien cordialement,</w:t>
+              <w:t xml:space="preserve">Firas</w:t>
             </w:r>
           </w:p>
           <w:p>
@@ -2885,49 +2797,7 @@
                 <w:sz w:val="21"/>
                 <w:szCs w:val="21"/>
               </w:rPr>
-              <w:t xml:space="preserve">Prénom Nom, Atelier Truelle</w:t>
-            </w:r>
-          </w:p>
-          <w:p>
-            <w:pPr>
-              <w:spacing w:after="90" w:line="280"/>
-            </w:pPr>
-            <w:r>
-              <w:rPr>
-                <w:rFonts w:ascii="Calibri" w:cs="Calibri" w:eastAsia="Calibri" w:hAnsi="Calibri"/>
-                <w:color w:val="14191C"/>
-                <w:sz w:val="21"/>
-                <w:szCs w:val="21"/>
-              </w:rPr>
-              <w:t xml:space="preserve">Sites internet pour les entreprises du bâtiment, Île-de-France</w:t>
-            </w:r>
-          </w:p>
-          <w:p>
-            <w:pPr>
-              <w:spacing w:after="90" w:line="280"/>
-            </w:pPr>
-            <w:r>
-              <w:rPr>
-                <w:rFonts w:ascii="Calibri" w:cs="Calibri" w:eastAsia="Calibri" w:hAnsi="Calibri"/>
-                <w:color w:val="14191C"/>
-                <w:sz w:val="21"/>
-                <w:szCs w:val="21"/>
-              </w:rPr>
-              <w:t xml:space="preserve">06 00 00 00 00 · contact@ateliertruelle.fr · ateliertruelle.fr</w:t>
-            </w:r>
-          </w:p>
-          <w:p>
-            <w:pPr>
-              <w:spacing w:after="90" w:line="280"/>
-            </w:pPr>
-            <w:r>
-              <w:rPr>
-                <w:rFonts w:ascii="Calibri" w:cs="Calibri" w:eastAsia="Calibri" w:hAnsi="Calibri"/>
-                <w:color w:val="14191C"/>
-                <w:sz w:val="21"/>
-                <w:szCs w:val="21"/>
-              </w:rPr>
-              <w:t xml:space="preserve">Vous ne souhaitez plus recevoir de message de notre part ? Répondez « stop » : nous ne vous écrirons plus.</w:t>
+              <w:t xml:space="preserve">Atelier Truelle · 06 00 00 00 00</w:t>
             </w:r>
           </w:p>
         </w:tc>
@@ -3026,7 +2896,7 @@
                 <w:sz w:val="21"/>
                 <w:szCs w:val="21"/>
               </w:rPr>
-              <w:t xml:space="preserve">Notre rendez-vous du [date]</w:t>
+              <w:t xml:space="preserve">Notre rendez-vous de [jour]</w:t>
             </w:r>
           </w:p>
           <w:p>
@@ -3040,7 +2910,7 @@
                 <w:sz w:val="21"/>
                 <w:szCs w:val="21"/>
               </w:rPr>
-              <w:t xml:space="preserve">Bonjour [Monsieur / Madame Nom],</w:t>
+              <w:t xml:space="preserve">Bonjour Monsieur [Nom],</w:t>
             </w:r>
           </w:p>
           <w:p>
@@ -3054,27 +2924,7 @@
                 <w:sz w:val="21"/>
                 <w:szCs w:val="21"/>
               </w:rPr>
-              <w:t xml:space="preserve">Merci pour notre échange. Je confirme notre rendez-vous le </w:t>
-            </w:r>
-            <w:r>
-              <w:rPr>
-                <w:rFonts w:ascii="Calibri" w:cs="Calibri" w:eastAsia="Calibri" w:hAnsi="Calibri"/>
-                <w:b/>
-                <w:bCs/>
-                <w:color w:val="14191C"/>
-                <w:sz w:val="21"/>
-                <w:szCs w:val="21"/>
-              </w:rPr>
-              <w:t xml:space="preserve">[date] à [heure]</w:t>
-            </w:r>
-            <w:r>
-              <w:rPr>
-                <w:rFonts w:ascii="Calibri" w:cs="Calibri" w:eastAsia="Calibri" w:hAnsi="Calibri"/>
-                <w:color w:val="14191C"/>
-                <w:sz w:val="21"/>
-                <w:szCs w:val="21"/>
-              </w:rPr>
-              <w:t xml:space="preserve">, [à votre agence, adresse / en visio : lien].</w:t>
+              <w:t xml:space="preserve">Merci pour tout à l'heure. Je passe donc [jour] à [heure] [à l'agence, rue …].</w:t>
             </w:r>
           </w:p>
           <w:p>
@@ -3088,7 +2938,7 @@
                 <w:sz w:val="21"/>
                 <w:szCs w:val="21"/>
               </w:rPr>
-              <w:t xml:space="preserve">Je viendrai avec la maquette sur tablette. Si vous avez des photos de chantiers récents, des avis clients ou des documents (qualifications, plaquette), apportez-les : nous pourrons les intégrer.</w:t>
+              <w:t xml:space="preserve">Si vous avez des photos de chantiers récents, mettez-les de côté, on pourra les ajouter.</w:t>
             </w:r>
           </w:p>
           <w:p>
@@ -3102,7 +2952,7 @@
                 <w:sz w:val="21"/>
                 <w:szCs w:val="21"/>
               </w:rPr>
-              <w:t xml:space="preserve">Bien cordialement,</w:t>
+              <w:t xml:space="preserve">À [jour],</w:t>
             </w:r>
           </w:p>
           <w:p>
@@ -3116,7 +2966,7 @@
                 <w:sz w:val="21"/>
                 <w:szCs w:val="21"/>
               </w:rPr>
-              <w:t xml:space="preserve">Prénom Nom, Atelier Truelle</w:t>
+              <w:t xml:space="preserve">Firas</w:t>
             </w:r>
           </w:p>
           <w:p>
@@ -3130,35 +2980,7 @@
                 <w:sz w:val="21"/>
                 <w:szCs w:val="21"/>
               </w:rPr>
-              <w:t xml:space="preserve">Sites internet pour les entreprises du bâtiment, Île-de-France</w:t>
-            </w:r>
-          </w:p>
-          <w:p>
-            <w:pPr>
-              <w:spacing w:after="90" w:line="280"/>
-            </w:pPr>
-            <w:r>
-              <w:rPr>
-                <w:rFonts w:ascii="Calibri" w:cs="Calibri" w:eastAsia="Calibri" w:hAnsi="Calibri"/>
-                <w:color w:val="14191C"/>
-                <w:sz w:val="21"/>
-                <w:szCs w:val="21"/>
-              </w:rPr>
-              <w:t xml:space="preserve">06 00 00 00 00 · contact@ateliertruelle.fr · ateliertruelle.fr</w:t>
-            </w:r>
-          </w:p>
-          <w:p>
-            <w:pPr>
-              <w:spacing w:after="90" w:line="280"/>
-            </w:pPr>
-            <w:r>
-              <w:rPr>
-                <w:rFonts w:ascii="Calibri" w:cs="Calibri" w:eastAsia="Calibri" w:hAnsi="Calibri"/>
-                <w:color w:val="14191C"/>
-                <w:sz w:val="21"/>
-                <w:szCs w:val="21"/>
-              </w:rPr>
-              <w:t xml:space="preserve">Vous ne souhaitez plus recevoir de message de notre part ? Répondez « stop » : nous ne vous écrirons plus.</w:t>
+              <w:t xml:space="preserve">Atelier Truelle · 06 00 00 00 00</w:t>
             </w:r>
           </w:p>
         </w:tc>
@@ -3257,7 +3079,7 @@
                 <w:sz w:val="21"/>
                 <w:szCs w:val="21"/>
               </w:rPr>
-              <w:t xml:space="preserve">[Entreprise] : votre devis et ce que nous avons décidé</w:t>
+              <w:t xml:space="preserve">Le devis pour votre site</w:t>
             </w:r>
           </w:p>
           <w:p>
@@ -3271,7 +3093,7 @@
                 <w:sz w:val="21"/>
                 <w:szCs w:val="21"/>
               </w:rPr>
-              <w:t xml:space="preserve">Bonjour [Monsieur / Madame Nom],</w:t>
+              <w:t xml:space="preserve">Bonjour Monsieur [Nom],</w:t>
             </w:r>
           </w:p>
           <w:p>
@@ -3285,7 +3107,7 @@
                 <w:sz w:val="21"/>
                 <w:szCs w:val="21"/>
               </w:rPr>
-              <w:t xml:space="preserve">Comme convenu, voici le devis pour votre nouveau site (pièce jointe). En résumé :</w:t>
+              <w:t xml:space="preserve">Merci pour votre accueil hier. Comme promis, voici le devis (en pièce jointe).</w:t>
             </w:r>
           </w:p>
           <w:p>
@@ -3299,21 +3121,7 @@
                 <w:sz w:val="21"/>
                 <w:szCs w:val="21"/>
               </w:rPr>
-              <w:t xml:space="preserve">[3 à 5 lignes : ce qui est inclus, les modifications demandées pendant le rendez-vous, le délai de mise en ligne, le prix et l'abonnement mensuel].</w:t>
-            </w:r>
-          </w:p>
-          <w:p>
-            <w:pPr>
-              <w:spacing w:after="90" w:line="280"/>
-            </w:pPr>
-            <w:r>
-              <w:rPr>
-                <w:rFonts w:ascii="Calibri" w:cs="Calibri" w:eastAsia="Calibri" w:hAnsi="Calibri"/>
-                <w:color w:val="14191C"/>
-                <w:sz w:val="21"/>
-                <w:szCs w:val="21"/>
-              </w:rPr>
-              <w:t xml:space="preserve">La maquette a été mise à jour avec vos remarques : </w:t>
+              <w:t xml:space="preserve">J'ai déjà fait les changements dont on a parlé, [la photo de l'agence, les horaires, …] : </w:t>
             </w:r>
             <w:r>
               <w:rPr>
@@ -3326,15 +3134,6 @@
               </w:rPr>
               <w:t xml:space="preserve">[lien]</w:t>
             </w:r>
-            <w:r>
-              <w:rPr>
-                <w:rFonts w:ascii="Calibri" w:cs="Calibri" w:eastAsia="Calibri" w:hAnsi="Calibri"/>
-                <w:color w:val="14191C"/>
-                <w:sz w:val="21"/>
-                <w:szCs w:val="21"/>
-              </w:rPr>
-              <w:t xml:space="preserve">.</w:t>
-            </w:r>
           </w:p>
           <w:p>
             <w:pPr>
@@ -3347,7 +3146,7 @@
                 <w:sz w:val="21"/>
                 <w:szCs w:val="21"/>
               </w:rPr>
-              <w:t xml:space="preserve">Pour lancer, il suffit de signer le devis (signature électronique, lien dans le document) ; nous démarrons dès réception de l'acompte.</w:t>
+              <w:t xml:space="preserve">Si quelque chose ne va pas dans le devis, dites-le moi, on regarde ensemble.</w:t>
             </w:r>
           </w:p>
           <w:p>
@@ -3361,7 +3160,7 @@
                 <w:sz w:val="21"/>
                 <w:szCs w:val="21"/>
               </w:rPr>
-              <w:t xml:space="preserve">Bien cordialement,</w:t>
+              <w:t xml:space="preserve">Firas</w:t>
             </w:r>
           </w:p>
           <w:p>
@@ -3375,49 +3174,7 @@
                 <w:sz w:val="21"/>
                 <w:szCs w:val="21"/>
               </w:rPr>
-              <w:t xml:space="preserve">Prénom Nom, Atelier Truelle</w:t>
-            </w:r>
-          </w:p>
-          <w:p>
-            <w:pPr>
-              <w:spacing w:after="90" w:line="280"/>
-            </w:pPr>
-            <w:r>
-              <w:rPr>
-                <w:rFonts w:ascii="Calibri" w:cs="Calibri" w:eastAsia="Calibri" w:hAnsi="Calibri"/>
-                <w:color w:val="14191C"/>
-                <w:sz w:val="21"/>
-                <w:szCs w:val="21"/>
-              </w:rPr>
-              <w:t xml:space="preserve">Sites internet pour les entreprises du bâtiment, Île-de-France</w:t>
-            </w:r>
-          </w:p>
-          <w:p>
-            <w:pPr>
-              <w:spacing w:after="90" w:line="280"/>
-            </w:pPr>
-            <w:r>
-              <w:rPr>
-                <w:rFonts w:ascii="Calibri" w:cs="Calibri" w:eastAsia="Calibri" w:hAnsi="Calibri"/>
-                <w:color w:val="14191C"/>
-                <w:sz w:val="21"/>
-                <w:szCs w:val="21"/>
-              </w:rPr>
-              <w:t xml:space="preserve">06 00 00 00 00 · contact@ateliertruelle.fr · ateliertruelle.fr</w:t>
-            </w:r>
-          </w:p>
-          <w:p>
-            <w:pPr>
-              <w:spacing w:after="90" w:line="280"/>
-            </w:pPr>
-            <w:r>
-              <w:rPr>
-                <w:rFonts w:ascii="Calibri" w:cs="Calibri" w:eastAsia="Calibri" w:hAnsi="Calibri"/>
-                <w:color w:val="14191C"/>
-                <w:sz w:val="21"/>
-                <w:szCs w:val="21"/>
-              </w:rPr>
-              <w:t xml:space="preserve">Vous ne souhaitez plus recevoir de message de notre part ? Répondez « stop » : nous ne vous écrirons plus.</w:t>
+              <w:t xml:space="preserve">Atelier Truelle · 06 00 00 00 00</w:t>
             </w:r>
           </w:p>
         </w:tc>
@@ -3516,7 +3273,7 @@
                 <w:sz w:val="21"/>
                 <w:szCs w:val="21"/>
               </w:rPr>
-              <w:t xml:space="preserve">Re : votre devis</w:t>
+              <w:t xml:space="preserve">Re : Le devis pour votre site</w:t>
             </w:r>
           </w:p>
           <w:p>
@@ -3530,7 +3287,7 @@
                 <w:sz w:val="21"/>
                 <w:szCs w:val="21"/>
               </w:rPr>
-              <w:t xml:space="preserve">Bonjour [Monsieur / Madame Nom],</w:t>
+              <w:t xml:space="preserve">Bonjour Monsieur [Nom],</w:t>
             </w:r>
           </w:p>
           <w:p>
@@ -3544,7 +3301,7 @@
                 <w:sz w:val="21"/>
                 <w:szCs w:val="21"/>
               </w:rPr>
-              <w:t xml:space="preserve">Avez-vous pu regarder le devis ? Si un point vous fait hésiter (prix, délai, contenu), dites-le moi : on peut l'ajuster, ou commencer par une première étape.</w:t>
+              <w:t xml:space="preserve">Vous avez eu le temps de regarder le devis ? S'il y a un point qui vous fait hésiter, on peut en parler, ou commencer plus simplement.</w:t>
             </w:r>
           </w:p>
           <w:p>
@@ -3558,7 +3315,7 @@
                 <w:sz w:val="21"/>
                 <w:szCs w:val="21"/>
               </w:rPr>
-              <w:t xml:space="preserve">Bien cordialement,</w:t>
+              <w:t xml:space="preserve">Firas</w:t>
             </w:r>
           </w:p>
           <w:p>
@@ -3572,49 +3329,7 @@
                 <w:sz w:val="21"/>
                 <w:szCs w:val="21"/>
               </w:rPr>
-              <w:t xml:space="preserve">Prénom Nom, Atelier Truelle</w:t>
-            </w:r>
-          </w:p>
-          <w:p>
-            <w:pPr>
-              <w:spacing w:after="90" w:line="280"/>
-            </w:pPr>
-            <w:r>
-              <w:rPr>
-                <w:rFonts w:ascii="Calibri" w:cs="Calibri" w:eastAsia="Calibri" w:hAnsi="Calibri"/>
-                <w:color w:val="14191C"/>
-                <w:sz w:val="21"/>
-                <w:szCs w:val="21"/>
-              </w:rPr>
-              <w:t xml:space="preserve">Sites internet pour les entreprises du bâtiment, Île-de-France</w:t>
-            </w:r>
-          </w:p>
-          <w:p>
-            <w:pPr>
-              <w:spacing w:after="90" w:line="280"/>
-            </w:pPr>
-            <w:r>
-              <w:rPr>
-                <w:rFonts w:ascii="Calibri" w:cs="Calibri" w:eastAsia="Calibri" w:hAnsi="Calibri"/>
-                <w:color w:val="14191C"/>
-                <w:sz w:val="21"/>
-                <w:szCs w:val="21"/>
-              </w:rPr>
-              <w:t xml:space="preserve">06 00 00 00 00 · contact@ateliertruelle.fr · ateliertruelle.fr</w:t>
-            </w:r>
-          </w:p>
-          <w:p>
-            <w:pPr>
-              <w:spacing w:after="90" w:line="280"/>
-            </w:pPr>
-            <w:r>
-              <w:rPr>
-                <w:rFonts w:ascii="Calibri" w:cs="Calibri" w:eastAsia="Calibri" w:hAnsi="Calibri"/>
-                <w:color w:val="14191C"/>
-                <w:sz w:val="21"/>
-                <w:szCs w:val="21"/>
-              </w:rPr>
-              <w:t xml:space="preserve">Vous ne souhaitez plus recevoir de message de notre part ? Répondez « stop » : nous ne vous écrirons plus.</w:t>
+              <w:t xml:space="preserve">Atelier Truelle · 06 00 00 00 00</w:t>
             </w:r>
           </w:p>
         </w:tc>
@@ -3713,7 +3428,7 @@
                 <w:sz w:val="21"/>
                 <w:szCs w:val="21"/>
               </w:rPr>
-              <w:t xml:space="preserve">Bienvenue : la suite pour votre site</w:t>
+              <w:t xml:space="preserve">C'est parti pour votre site</w:t>
             </w:r>
           </w:p>
           <w:p>
@@ -3727,7 +3442,7 @@
                 <w:sz w:val="21"/>
                 <w:szCs w:val="21"/>
               </w:rPr>
-              <w:t xml:space="preserve">Bonjour [Monsieur / Madame Nom],</w:t>
+              <w:t xml:space="preserve">Bonjour Monsieur [Nom],</w:t>
             </w:r>
           </w:p>
           <w:p>
@@ -3741,7 +3456,7 @@
                 <w:sz w:val="21"/>
                 <w:szCs w:val="21"/>
               </w:rPr>
-              <w:t xml:space="preserve">Merci pour votre confiance. Voici les prochaines étapes : [1. nous récupérons l'accès à votre nom de domaine ; 2. vous nous envoyez vos photos récentes ; 3. mise en ligne prévue le [date]].</w:t>
+              <w:t xml:space="preserve">Merci pour votre confiance. Pour la suite, j'aurai besoin [de l'accès à votre nom de domaine et de quelques photos récentes]. Je compte mettre le site en ligne [vers le …].</w:t>
             </w:r>
           </w:p>
           <w:p>
@@ -3755,7 +3470,7 @@
                 <w:sz w:val="21"/>
                 <w:szCs w:val="21"/>
               </w:rPr>
-              <w:t xml:space="preserve">Votre site, votre nom de domaine et vos contenus restent à vous, quoi qu'il arrive.</w:t>
+              <w:t xml:space="preserve">Le site, le nom de domaine et les contenus restent à vous, quoi qu'il arrive.</w:t>
             </w:r>
           </w:p>
           <w:p>
@@ -3769,7 +3484,7 @@
                 <w:sz w:val="21"/>
                 <w:szCs w:val="21"/>
               </w:rPr>
-              <w:t xml:space="preserve">Bien cordialement,</w:t>
+              <w:t xml:space="preserve">Firas</w:t>
             </w:r>
           </w:p>
           <w:p>
@@ -3783,49 +3498,7 @@
                 <w:sz w:val="21"/>
                 <w:szCs w:val="21"/>
               </w:rPr>
-              <w:t xml:space="preserve">Prénom Nom, Atelier Truelle</w:t>
-            </w:r>
-          </w:p>
-          <w:p>
-            <w:pPr>
-              <w:spacing w:after="90" w:line="280"/>
-            </w:pPr>
-            <w:r>
-              <w:rPr>
-                <w:rFonts w:ascii="Calibri" w:cs="Calibri" w:eastAsia="Calibri" w:hAnsi="Calibri"/>
-                <w:color w:val="14191C"/>
-                <w:sz w:val="21"/>
-                <w:szCs w:val="21"/>
-              </w:rPr>
-              <w:t xml:space="preserve">Sites internet pour les entreprises du bâtiment, Île-de-France</w:t>
-            </w:r>
-          </w:p>
-          <w:p>
-            <w:pPr>
-              <w:spacing w:after="90" w:line="280"/>
-            </w:pPr>
-            <w:r>
-              <w:rPr>
-                <w:rFonts w:ascii="Calibri" w:cs="Calibri" w:eastAsia="Calibri" w:hAnsi="Calibri"/>
-                <w:color w:val="14191C"/>
-                <w:sz w:val="21"/>
-                <w:szCs w:val="21"/>
-              </w:rPr>
-              <w:t xml:space="preserve">06 00 00 00 00 · contact@ateliertruelle.fr · ateliertruelle.fr</w:t>
-            </w:r>
-          </w:p>
-          <w:p>
-            <w:pPr>
-              <w:spacing w:after="90" w:line="280"/>
-            </w:pPr>
-            <w:r>
-              <w:rPr>
-                <w:rFonts w:ascii="Calibri" w:cs="Calibri" w:eastAsia="Calibri" w:hAnsi="Calibri"/>
-                <w:color w:val="14191C"/>
-                <w:sz w:val="21"/>
-                <w:szCs w:val="21"/>
-              </w:rPr>
-              <w:t xml:space="preserve">Vous ne souhaitez plus recevoir de message de notre part ? Répondez « stop » : nous ne vous écrirons plus.</w:t>
+              <w:t xml:space="preserve">Atelier Truelle · 06 00 00 00 00</w:t>
             </w:r>
           </w:p>
         </w:tc>
@@ -3850,7 +3523,7 @@
           <w:sz w:val="24"/>
           <w:szCs w:val="24"/>
         </w:rPr>
-        <w:t xml:space="preserve">E-mail 7 · Bilan et avis</w:t>
+        <w:t xml:space="preserve">E-mail 7 · Un mois après</w:t>
       </w:r>
     </w:p>
     <w:tbl>
@@ -3938,7 +3611,7 @@
                 <w:sz w:val="21"/>
                 <w:szCs w:val="21"/>
               </w:rPr>
-              <w:t xml:space="preserve">Bonjour [Monsieur / Madame Nom],</w:t>
+              <w:t xml:space="preserve">Bonjour Monsieur [Nom],</w:t>
             </w:r>
           </w:p>
           <w:p>
@@ -3952,7 +3625,7 @@
                 <w:sz w:val="21"/>
                 <w:szCs w:val="21"/>
               </w:rPr>
-              <w:t xml:space="preserve">Votre site est en ligne depuis un mois : [chiffres réels du mois : visites, appels depuis le site, demandes de devis].</w:t>
+              <w:t xml:space="preserve">Votre site tourne depuis un mois. [Chiffres réels : X visites, X appels depuis le site, X demandes de devis.]</w:t>
             </w:r>
           </w:p>
           <w:p>
@@ -3966,7 +3639,7 @@
                 <w:sz w:val="21"/>
                 <w:szCs w:val="21"/>
               </w:rPr>
-              <w:t xml:space="preserve">Si vous êtes satisfait, un avis sur notre fiche Google nous aiderait beaucoup : </w:t>
+              <w:t xml:space="preserve">Si vous en êtes content, un petit avis sur Google m'aiderait beaucoup : </w:t>
             </w:r>
             <w:r>
               <w:rPr>
@@ -3986,7 +3659,7 @@
                 <w:sz w:val="21"/>
                 <w:szCs w:val="21"/>
               </w:rPr>
-              <w:t xml:space="preserve">. Et si vous connaissez un artisan qui a besoin du même travail, nous lui ferons sa maquette gratuitement.</w:t>
+              <w:t xml:space="preserve">. Et si vous connaissez un artisan dans le même cas que vous, je lui ferai sa maquette avec plaisir.</w:t>
             </w:r>
           </w:p>
           <w:p>
@@ -4000,7 +3673,7 @@
                 <w:sz w:val="21"/>
                 <w:szCs w:val="21"/>
               </w:rPr>
-              <w:t xml:space="preserve">Bien cordialement,</w:t>
+              <w:t xml:space="preserve">Firas</w:t>
             </w:r>
           </w:p>
           <w:p>
@@ -4014,49 +3687,7 @@
                 <w:sz w:val="21"/>
                 <w:szCs w:val="21"/>
               </w:rPr>
-              <w:t xml:space="preserve">Prénom Nom, Atelier Truelle</w:t>
-            </w:r>
-          </w:p>
-          <w:p>
-            <w:pPr>
-              <w:spacing w:after="90" w:line="280"/>
-            </w:pPr>
-            <w:r>
-              <w:rPr>
-                <w:rFonts w:ascii="Calibri" w:cs="Calibri" w:eastAsia="Calibri" w:hAnsi="Calibri"/>
-                <w:color w:val="14191C"/>
-                <w:sz w:val="21"/>
-                <w:szCs w:val="21"/>
-              </w:rPr>
-              <w:t xml:space="preserve">Sites internet pour les entreprises du bâtiment, Île-de-France</w:t>
-            </w:r>
-          </w:p>
-          <w:p>
-            <w:pPr>
-              <w:spacing w:after="90" w:line="280"/>
-            </w:pPr>
-            <w:r>
-              <w:rPr>
-                <w:rFonts w:ascii="Calibri" w:cs="Calibri" w:eastAsia="Calibri" w:hAnsi="Calibri"/>
-                <w:color w:val="14191C"/>
-                <w:sz w:val="21"/>
-                <w:szCs w:val="21"/>
-              </w:rPr>
-              <w:t xml:space="preserve">06 00 00 00 00 · contact@ateliertruelle.fr · ateliertruelle.fr</w:t>
-            </w:r>
-          </w:p>
-          <w:p>
-            <w:pPr>
-              <w:spacing w:after="90" w:line="280"/>
-            </w:pPr>
-            <w:r>
-              <w:rPr>
-                <w:rFonts w:ascii="Calibri" w:cs="Calibri" w:eastAsia="Calibri" w:hAnsi="Calibri"/>
-                <w:color w:val="14191C"/>
-                <w:sz w:val="21"/>
-                <w:szCs w:val="21"/>
-              </w:rPr>
-              <w:t xml:space="preserve">Vous ne souhaitez plus recevoir de message de notre part ? Répondez « stop » : nous ne vous écrirons plus.</w:t>
+              <w:t xml:space="preserve">Atelier Truelle · 06 00 00 00 00</w:t>
             </w:r>
           </w:p>
         </w:tc>

</xml_diff>